<commit_message>
fix: delete .pcap button, leaving logic (commenting 3 lines), adding conlusions and new interface screenshot
</commit_message>
<xml_diff>
--- a/Szkic-projektu.docx
+++ b/Szkic-projektu.docx
@@ -2600,7 +2600,7 @@
                                     </pic:cNvPicPr>
                                   </pic:nvPicPr>
                                   <pic:blipFill>
-                                    <a:blip r:embed="rId15"/>
+                                    <a:blip r:embed="rId14"/>
                                     <a:stretch>
                                       <a:fillRect/>
                                     </a:stretch>
@@ -3071,7 +3071,7 @@
                     </pic:cNvPicPr>
                   </pic:nvPicPr>
                   <pic:blipFill>
-                    <a:blip r:embed="rId16"/>
+                    <a:blip r:embed="rId15"/>
                     <a:stretch>
                       <a:fillRect/>
                     </a:stretch>
@@ -3649,7 +3649,7 @@
                     </pic:cNvPicPr>
                   </pic:nvPicPr>
                   <pic:blipFill>
-                    <a:blip r:embed="rId17"/>
+                    <a:blip r:embed="rId16"/>
                     <a:stretch>
                       <a:fillRect/>
                     </a:stretch>
@@ -4390,7 +4390,7 @@
                     </pic:cNvPicPr>
                   </pic:nvPicPr>
                   <pic:blipFill>
-                    <a:blip r:embed="rId18">
+                    <a:blip r:embed="rId17">
                       <a:extLst>
                         <a:ext uri="{28A0092B-C50C-407E-A947-70E740481C1C}">
                           <a14:useLocalDpi xmlns:a14="http://schemas.microsoft.com/office/drawing/2010/main" val="0"/>
@@ -4811,7 +4811,7 @@
                     <pic:cNvPicPr/>
                   </pic:nvPicPr>
                   <pic:blipFill>
-                    <a:blip r:embed="rId19">
+                    <a:blip r:embed="rId18">
                       <a:extLst>
                         <a:ext uri="{28A0092B-C50C-407E-A947-70E740481C1C}">
                           <a14:useLocalDpi xmlns:a14="http://schemas.microsoft.com/office/drawing/2010/main" val="0"/>
@@ -5172,16 +5172,16 @@
           <w:noProof/>
         </w:rPr>
         <w:drawing>
-          <wp:anchor distT="0" distB="0" distL="114300" distR="114300" simplePos="0" relativeHeight="251661312" behindDoc="0" locked="0" layoutInCell="1" allowOverlap="1" wp14:anchorId="76CD1390" wp14:editId="3864FA37">
+          <wp:anchor distT="0" distB="0" distL="114300" distR="114300" simplePos="0" relativeHeight="251661312" behindDoc="0" locked="0" layoutInCell="1" allowOverlap="1" wp14:anchorId="76CD1390" wp14:editId="71CFB1B2">
             <wp:simplePos x="0" y="0"/>
             <wp:positionH relativeFrom="margin">
-              <wp:align>right</wp:align>
+              <wp:posOffset>0</wp:posOffset>
             </wp:positionH>
             <wp:positionV relativeFrom="paragraph">
-              <wp:posOffset>1883410</wp:posOffset>
+              <wp:posOffset>2132330</wp:posOffset>
             </wp:positionV>
-            <wp:extent cx="5943600" cy="3655695"/>
-            <wp:effectExtent l="0" t="0" r="0" b="1905"/>
+            <wp:extent cx="5943600" cy="3162300"/>
+            <wp:effectExtent l="0" t="0" r="0" b="0"/>
             <wp:wrapSquare wrapText="bothSides"/>
             <wp:docPr id="795302678" name="Obraz 1"/>
             <wp:cNvGraphicFramePr>
@@ -5191,11 +5191,11 @@
               <a:graphicData uri="http://schemas.openxmlformats.org/drawingml/2006/picture">
                 <pic:pic xmlns:pic="http://schemas.openxmlformats.org/drawingml/2006/picture">
                   <pic:nvPicPr>
-                    <pic:cNvPr id="795302678" name=""/>
+                    <pic:cNvPr id="795302678" name="Obraz 1"/>
                     <pic:cNvPicPr/>
                   </pic:nvPicPr>
                   <pic:blipFill>
-                    <a:blip r:embed="rId20" cstate="print">
+                    <a:blip r:embed="rId19" cstate="print">
                       <a:extLst>
                         <a:ext uri="{28A0092B-C50C-407E-A947-70E740481C1C}">
                           <a14:useLocalDpi xmlns:a14="http://schemas.microsoft.com/office/drawing/2010/main" val="0"/>
@@ -5209,7 +5209,7 @@
                   <pic:spPr>
                     <a:xfrm>
                       <a:off x="0" y="0"/>
-                      <a:ext cx="5943600" cy="3655695"/>
+                      <a:ext cx="5943600" cy="3162300"/>
                     </a:xfrm>
                     <a:prstGeom prst="rect">
                       <a:avLst/>
@@ -5218,6 +5218,9 @@
                 </pic:pic>
               </a:graphicData>
             </a:graphic>
+            <wp14:sizeRelV relativeFrom="margin">
+              <wp14:pctHeight>0</wp14:pctHeight>
+            </wp14:sizeRelV>
           </wp:anchor>
         </w:drawing>
       </w:r>
@@ -5226,46 +5229,7 @@
           <w:sz w:val="28"/>
           <w:szCs w:val="28"/>
         </w:rPr>
-        <w:t>P</w:t>
-      </w:r>
-      <w:r>
-        <w:rPr>
-          <w:sz w:val="28"/>
-          <w:szCs w:val="28"/>
-        </w:rPr>
-        <w:t>rzetestowaliśmy również wczytywanie surowego ruchu sieciowego bezpośrednio z plików .</w:t>
-      </w:r>
-      <w:proofErr w:type="spellStart"/>
-      <w:r>
-        <w:rPr>
-          <w:sz w:val="28"/>
-          <w:szCs w:val="28"/>
-        </w:rPr>
-        <w:t>pcap</w:t>
-      </w:r>
-      <w:proofErr w:type="spellEnd"/>
-      <w:r>
-        <w:rPr>
-          <w:sz w:val="28"/>
-          <w:szCs w:val="28"/>
-        </w:rPr>
-        <w:t xml:space="preserve"> przy użyciu zintegrowanego narzędzia </w:t>
-      </w:r>
-      <w:proofErr w:type="spellStart"/>
-      <w:r>
-        <w:rPr>
-          <w:sz w:val="28"/>
-          <w:szCs w:val="28"/>
-        </w:rPr>
-        <w:t>tshark</w:t>
-      </w:r>
-      <w:proofErr w:type="spellEnd"/>
-      <w:r>
-        <w:rPr>
-          <w:sz w:val="28"/>
-          <w:szCs w:val="28"/>
-        </w:rPr>
-        <w:t>. Weryfikacji poddano także wydajność interfejsu przy przetwarzaniu większych próbek danych oraz odporność programu na błędy użytkownika. Próba załadowania nieobsługiwanego formatu czy pustego pliku jest bezpiecznie przechwytywana i</w:t>
+        <w:t>Weryfikacji poddano także wydajność interfejsu przy przetwarzaniu większych próbek danych oraz odporność programu na błędy użytkownika. Próba załadowania nieobsługiwanego formatu czy pustego pliku jest bezpiecznie przechwytywana i</w:t>
       </w:r>
       <w:r>
         <w:rPr>
@@ -5520,6 +5484,267 @@
       </w:r>
       <w:bookmarkEnd w:id="6"/>
     </w:p>
+    <w:p/>
+    <w:p>
+      <w:pPr>
+        <w:ind w:left="360" w:firstLine="360"/>
+        <w:jc w:val="both"/>
+        <w:rPr>
+          <w:sz w:val="28"/>
+          <w:szCs w:val="28"/>
+        </w:rPr>
+      </w:pPr>
+      <w:r>
+        <w:rPr>
+          <w:sz w:val="28"/>
+          <w:szCs w:val="28"/>
+        </w:rPr>
+        <w:t xml:space="preserve">Przy tworzeniu tego projektu nauczyliśmy się, że stworzenie zautomatyzowanego systemu do wykrywania anomalii sieciowych wymaga nie tylko doboru odpowiedniego modelu uczenia maszynowego, ale także musieliśmy sobie poradzić z drastycznym niezbalansowaniem klas. Aby to nie wpłynęło błędnie na ocenę modelu przy jego doborze, zastosowaliśmy metrykę F1-Score, która eliminuje fałszywie optymistyczne wyniki. </w:t>
+      </w:r>
+    </w:p>
+    <w:p>
+      <w:pPr>
+        <w:ind w:left="360"/>
+        <w:jc w:val="both"/>
+        <w:rPr>
+          <w:sz w:val="28"/>
+          <w:szCs w:val="28"/>
+        </w:rPr>
+      </w:pPr>
+    </w:p>
+    <w:p>
+      <w:pPr>
+        <w:ind w:left="360" w:firstLine="360"/>
+        <w:jc w:val="both"/>
+        <w:rPr>
+          <w:sz w:val="28"/>
+          <w:szCs w:val="28"/>
+        </w:rPr>
+      </w:pPr>
+      <w:r>
+        <w:rPr>
+          <w:sz w:val="28"/>
+          <w:szCs w:val="28"/>
+        </w:rPr>
+        <w:t>Warto podkreślić, że założona przez nas struktura pracy i dotarcia do</w:t>
+      </w:r>
+      <w:r>
+        <w:rPr>
+          <w:sz w:val="28"/>
+          <w:szCs w:val="28"/>
+        </w:rPr>
+        <w:t> </w:t>
+      </w:r>
+      <w:r>
+        <w:rPr>
+          <w:sz w:val="28"/>
+          <w:szCs w:val="28"/>
+        </w:rPr>
+        <w:t>rozwiązania okazała się bardzo przyjemna i poprawna w trakcie wdrożenia. Przemyślany opis preferowanego rozwiązania był solidnym fundamentem, który pozwolił nam krok po kroku od teoretycznej analizy problemu przez zawiłe wyzwania implementacyjne aż po testowanie finalnej aplikacji.</w:t>
+      </w:r>
+    </w:p>
+    <w:p>
+      <w:pPr>
+        <w:ind w:left="360"/>
+        <w:jc w:val="both"/>
+        <w:rPr>
+          <w:sz w:val="28"/>
+          <w:szCs w:val="28"/>
+        </w:rPr>
+      </w:pPr>
+    </w:p>
+    <w:p>
+      <w:pPr>
+        <w:ind w:left="360" w:firstLine="360"/>
+        <w:jc w:val="both"/>
+        <w:rPr>
+          <w:sz w:val="28"/>
+          <w:szCs w:val="28"/>
+        </w:rPr>
+      </w:pPr>
+      <w:r>
+        <w:rPr>
+          <w:sz w:val="28"/>
+          <w:szCs w:val="28"/>
+        </w:rPr>
+        <w:t>Choć nasze rozwiązanie całkiem sprawnie wyszukuje i punktuje cyberataki, warto pamiętać o tym, że nie istnieje jedna, uniwersalna recepta na wykrycie absolutnie wszystkich anomalii. Mimo to, nasze narzędzie sprawnie izoluje uniwersalne atrybuty złośliwych pakietów, czego efektem jest jego bardzo wysoka dokładność.</w:t>
+      </w:r>
+    </w:p>
+    <w:p>
+      <w:pPr>
+        <w:ind w:left="360"/>
+        <w:jc w:val="both"/>
+        <w:rPr>
+          <w:sz w:val="28"/>
+          <w:szCs w:val="28"/>
+        </w:rPr>
+      </w:pPr>
+    </w:p>
+    <w:p>
+      <w:pPr>
+        <w:ind w:left="360" w:firstLine="360"/>
+        <w:jc w:val="both"/>
+        <w:rPr>
+          <w:sz w:val="28"/>
+          <w:szCs w:val="28"/>
+        </w:rPr>
+      </w:pPr>
+      <w:r>
+        <w:rPr>
+          <w:sz w:val="28"/>
+          <w:szCs w:val="28"/>
+        </w:rPr>
+        <w:t xml:space="preserve">Nasza aplikacja, mimo że w obecnej formie spełnia swoje zadanie, posiada ogromny potencjał </w:t>
+      </w:r>
+      <w:r>
+        <w:rPr>
+          <w:sz w:val="28"/>
+          <w:szCs w:val="28"/>
+        </w:rPr>
+        <w:t>do dalszego rozwoju. Można rozwinąć jej funkcjonalności do m.in. analizy w czasie rzeczywistym, klasyfikacji wieloklasowej (czyli nie tylko, że mamy do czynienia z atakiem, ale też jakim atakiem) czy integracji systemowej, aby program działał również proaktywnie, na przykład podpowiadając administratorowi, który port sieciowy należy zamknąć w</w:t>
+      </w:r>
+      <w:r>
+        <w:rPr>
+          <w:sz w:val="28"/>
+          <w:szCs w:val="28"/>
+        </w:rPr>
+        <w:t> </w:t>
+      </w:r>
+      <w:r>
+        <w:rPr>
+          <w:sz w:val="28"/>
+          <w:szCs w:val="28"/>
+        </w:rPr>
+        <w:t>odpowiedzi na wykryty ruch złośliwy.</w:t>
+      </w:r>
+    </w:p>
+    <w:p>
+      <w:pPr>
+        <w:ind w:left="360"/>
+        <w:jc w:val="both"/>
+        <w:rPr>
+          <w:sz w:val="28"/>
+          <w:szCs w:val="28"/>
+        </w:rPr>
+      </w:pPr>
+    </w:p>
+    <w:p>
+      <w:pPr>
+        <w:ind w:left="360" w:firstLine="360"/>
+        <w:jc w:val="both"/>
+        <w:rPr>
+          <w:sz w:val="28"/>
+          <w:szCs w:val="28"/>
+        </w:rPr>
+      </w:pPr>
+      <w:r>
+        <w:rPr>
+          <w:sz w:val="28"/>
+          <w:szCs w:val="28"/>
+        </w:rPr>
+        <w:t xml:space="preserve">Na koniec należy pamiętać, że </w:t>
+      </w:r>
+      <w:r>
+        <w:rPr>
+          <w:sz w:val="28"/>
+          <w:szCs w:val="28"/>
+        </w:rPr>
+        <w:t>branża</w:t>
+      </w:r>
+      <w:r>
+        <w:rPr>
+          <w:sz w:val="28"/>
+          <w:szCs w:val="28"/>
+        </w:rPr>
+        <w:t xml:space="preserve"> </w:t>
+      </w:r>
+      <w:proofErr w:type="spellStart"/>
+      <w:r>
+        <w:rPr>
+          <w:sz w:val="28"/>
+          <w:szCs w:val="28"/>
+        </w:rPr>
+        <w:t>cyberbezpieczeństwa</w:t>
+      </w:r>
+      <w:proofErr w:type="spellEnd"/>
+      <w:r>
+        <w:rPr>
+          <w:sz w:val="28"/>
+          <w:szCs w:val="28"/>
+        </w:rPr>
+        <w:t xml:space="preserve"> jest niezwykle dynamiczny. Z biegiem czasu z całą pewnością będą powstawać nowe, coraz bardziej zaawansowane ataki złośliwe. Z tego powodu nasza aplikacja</w:t>
+      </w:r>
+      <w:r>
+        <w:rPr>
+          <w:sz w:val="28"/>
+          <w:szCs w:val="28"/>
+        </w:rPr>
+        <w:t xml:space="preserve">, </w:t>
+      </w:r>
+      <w:r>
+        <w:rPr>
+          <w:sz w:val="28"/>
+          <w:szCs w:val="28"/>
+        </w:rPr>
+        <w:t>aby mogła skutecznie pełnić swoją funkcję na co dzień</w:t>
+      </w:r>
+      <w:r>
+        <w:rPr>
+          <w:sz w:val="28"/>
+          <w:szCs w:val="28"/>
+        </w:rPr>
+        <w:t>,</w:t>
+      </w:r>
+      <w:r>
+        <w:rPr>
+          <w:sz w:val="28"/>
+          <w:szCs w:val="28"/>
+        </w:rPr>
+        <w:t xml:space="preserve"> nie jest rozwiązaniem</w:t>
+      </w:r>
+      <w:r>
+        <w:rPr>
+          <w:sz w:val="28"/>
+          <w:szCs w:val="28"/>
+        </w:rPr>
+        <w:t>, które w przyszłości nadal będzie tak samo skuteczne</w:t>
+      </w:r>
+      <w:r>
+        <w:rPr>
+          <w:sz w:val="28"/>
+          <w:szCs w:val="28"/>
+        </w:rPr>
+        <w:t>. Wymaga ona stałej opieki, nadzoru i okresowego douczania przez specjalistów</w:t>
+      </w:r>
+      <w:r>
+        <w:rPr>
+          <w:sz w:val="28"/>
+          <w:szCs w:val="28"/>
+        </w:rPr>
+        <w:t xml:space="preserve"> i jego twórców, </w:t>
+      </w:r>
+      <w:r>
+        <w:rPr>
+          <w:sz w:val="28"/>
+          <w:szCs w:val="28"/>
+        </w:rPr>
+        <w:t>którzy będą na bieżąco dostosowywać ją do nowych</w:t>
+      </w:r>
+      <w:r>
+        <w:rPr>
+          <w:sz w:val="28"/>
+          <w:szCs w:val="28"/>
+        </w:rPr>
+        <w:t xml:space="preserve"> ataków</w:t>
+      </w:r>
+      <w:r>
+        <w:rPr>
+          <w:sz w:val="28"/>
+          <w:szCs w:val="28"/>
+        </w:rPr>
+        <w:t>.</w:t>
+      </w:r>
+    </w:p>
     <w:p>
       <w:pPr>
         <w:ind w:left="720"/>
@@ -5535,12 +5760,6 @@
           <w:sz w:val="28"/>
         </w:rPr>
       </w:pPr>
-      <w:r>
-        <w:rPr>
-          <w:sz w:val="28"/>
-        </w:rPr>
-        <w:br w:type="page"/>
-      </w:r>
     </w:p>
     <w:p>
       <w:pPr>
@@ -5555,7 +5774,6 @@
         <w:rPr>
           <w:sz w:val="28"/>
         </w:rPr>
-        <w:lastRenderedPageBreak/>
         <w:t>Literatura</w:t>
       </w:r>
       <w:bookmarkEnd w:id="7"/>
@@ -5577,7 +5795,7 @@
       <w:r>
         <w:t xml:space="preserve">: Materiały graficzne/Schemat poglądowy [Online]. Dostępne w Internecie: </w:t>
       </w:r>
-      <w:hyperlink r:id="rId21" w:history="1">
+      <w:hyperlink r:id="rId20" w:history="1">
         <w:r>
           <w:rPr>
             <w:rStyle w:val="Hipercze"/>
@@ -5775,7 +5993,7 @@
       <w:r>
         <w:t xml:space="preserve"> [Online]. Dostępne w Internecie: </w:t>
       </w:r>
-      <w:hyperlink r:id="rId22" w:history="1">
+      <w:hyperlink r:id="rId21" w:history="1">
         <w:r>
           <w:rPr>
             <w:rStyle w:val="Hipercze"/>
@@ -5908,12 +6126,12 @@
       </w:pPr>
     </w:p>
     <w:sectPr>
-      <w:headerReference w:type="even" r:id="rId23"/>
-      <w:headerReference w:type="default" r:id="rId24"/>
-      <w:footerReference w:type="even" r:id="rId25"/>
-      <w:footerReference w:type="default" r:id="rId26"/>
-      <w:headerReference w:type="first" r:id="rId27"/>
-      <w:footerReference w:type="first" r:id="rId28"/>
+      <w:headerReference w:type="even" r:id="rId22"/>
+      <w:headerReference w:type="default" r:id="rId23"/>
+      <w:footerReference w:type="even" r:id="rId24"/>
+      <w:footerReference w:type="default" r:id="rId25"/>
+      <w:headerReference w:type="first" r:id="rId26"/>
+      <w:footerReference w:type="first" r:id="rId27"/>
       <w:pgSz w:w="12240" w:h="15840"/>
       <w:pgMar w:top="1440" w:right="1440" w:bottom="2160" w:left="1440" w:header="1296" w:footer="1296" w:gutter="0"/>
       <w:pgNumType w:start="1"/>
@@ -9462,12 +9680,14 @@
     <w:rsid w:val="003A3E0D"/>
     <w:rsid w:val="00407C28"/>
     <w:rsid w:val="00410437"/>
+    <w:rsid w:val="0041570B"/>
     <w:rsid w:val="00441B8F"/>
     <w:rsid w:val="004428E7"/>
     <w:rsid w:val="004802D4"/>
     <w:rsid w:val="004D6C3A"/>
     <w:rsid w:val="004F4255"/>
     <w:rsid w:val="00644EC8"/>
+    <w:rsid w:val="0067158C"/>
     <w:rsid w:val="00687834"/>
     <w:rsid w:val="0069188E"/>
     <w:rsid w:val="006A6328"/>

</xml_diff>